<commit_message>
Updated Bible resource content for English, French, Hindi, Portuguese, Spanish, and Chinese on 2026-05-07
</commit_message>
<xml_diff>
--- a/eng/docx/022.content.docx
+++ b/eng/docx/022.content.docx
@@ -452,92 +452,9 @@
     </w:p>
     <w:p>
       <w:r>
-        <w:t>&lt;image: None&gt;</w:t>
-      </w:r>
-    </w:p>
-    <w:p>
-      <w:pPr/>
-      <w:r>
-        <w:rPr>
-          <w:lang w:val="en_US" w:bidi="en_US"/>
-        </w:rPr>
-      </w:r>
-      <w:hyperlink r:id="rId17">
-        <w:r>
-          <w:rPr>
-            <w:lang w:val="en_US" w:bidi="en_US"/>
-          </w:rPr>
-          <w:rPr>
-            <w:color w:val="0000EE"/>
-            <w:u w:val="single"/>
-          </w:rPr>
-          <w:t>link</w:t>
-        </w:r>
-      </w:hyperlink>
-      <w:r>
-        <w:rPr>
-          <w:lang w:val="en_US" w:bidi="en_US"/>
-        </w:rPr>
-      </w:r>
-      <w:r>
-        <w:rPr>
-          <w:lang w:val="en_US" w:bidi="en_US"/>
-        </w:rPr>
-      </w:r>
-    </w:p>
-    <w:p>
-      <w:pPr/>
-      <w:r>
-        <w:rPr>
-          <w:lang w:val="en_US" w:bidi="en_US"/>
-        </w:rPr>
-      </w:r>
-    </w:p>
-    <w:p>
-      <w:pPr>
-        <w:pStyle w:val="Heading2"/>
-      </w:pPr>
-      <w:r>
-        <w:rPr>
-          <w:lang w:val="en_US" w:bidi="en_US"/>
-        </w:rPr>
-        <w:t>Vultures Gathered Around a Dead Animal</w:t>
-      </w:r>
-      <w:r>
-        <w:rPr>
-          <w:lang w:val="en_US" w:bidi="en_US"/>
-        </w:rPr>
-      </w:r>
-    </w:p>
-    <w:p>
-      <w:pPr>
-        <w:pStyle w:val="Heading4"/>
-      </w:pPr>
-      <w:r>
-        <w:rPr>
-          <w:lang w:val="en_US" w:bidi="en_US"/>
-        </w:rPr>
-        <w:t>Image Content</w:t>
-      </w:r>
-      <w:r>
-        <w:rPr>
-          <w:lang w:val="en_US" w:bidi="en_US"/>
-        </w:rPr>
-      </w:r>
-    </w:p>
-    <w:p>
-      <w:pPr/>
-      <w:r>
-        <w:rPr>
-          <w:lang w:val="en_US" w:bidi="en_US"/>
-        </w:rPr>
-      </w:r>
-    </w:p>
-    <w:p>
-      <w:r>
         <w:drawing>
           <wp:inline xmlns:a="http://schemas.openxmlformats.org/drawingml/2006/main" xmlns:pic="http://schemas.openxmlformats.org/drawingml/2006/picture">
-            <wp:extent cx="6096000" cy="4059936"/>
+            <wp:extent cx="6096000" cy="4090416"/>
             <wp:docPr id="3" name="Picture 3"/>
             <wp:cNvGraphicFramePr>
               <a:graphicFrameLocks noChangeAspect="1"/>
@@ -550,7 +467,349 @@
                     <pic:cNvPicPr/>
                   </pic:nvPicPr>
                   <pic:blipFill>
-                    <a:blip r:embed="rId18"/>
+                    <a:blip r:embed="rId17"/>
+                    <a:stretch>
+                      <a:fillRect/>
+                    </a:stretch>
+                  </pic:blipFill>
+                  <pic:spPr>
+                    <a:xfrm>
+                      <a:off x="0" y="0"/>
+                      <a:ext cx="6096000" cy="4090416"/>
+                    </a:xfrm>
+                    <a:prstGeom prst="rect"/>
+                  </pic:spPr>
+                </pic:pic>
+              </a:graphicData>
+            </a:graphic>
+          </wp:inline>
+        </w:drawing>
+      </w:r>
+    </w:p>
+    <w:p>
+      <w:pPr/>
+      <w:r>
+        <w:rPr>
+          <w:lang w:val="en_US" w:bidi="en_US"/>
+        </w:rPr>
+      </w:r>
+      <w:hyperlink r:id="rId18">
+        <w:r>
+          <w:rPr>
+            <w:lang w:val="en_US" w:bidi="en_US"/>
+          </w:rPr>
+          <w:rPr>
+            <w:color w:val="0000EE"/>
+            <w:u w:val="single"/>
+          </w:rPr>
+          <w:t>link</w:t>
+        </w:r>
+      </w:hyperlink>
+      <w:r>
+        <w:rPr>
+          <w:lang w:val="en_US" w:bidi="en_US"/>
+        </w:rPr>
+      </w:r>
+      <w:r>
+        <w:rPr>
+          <w:lang w:val="en_US" w:bidi="en_US"/>
+        </w:rPr>
+      </w:r>
+    </w:p>
+    <w:p>
+      <w:pPr/>
+      <w:r>
+        <w:rPr>
+          <w:lang w:val="en_US" w:bidi="en_US"/>
+        </w:rPr>
+      </w:r>
+    </w:p>
+    <w:p>
+      <w:pPr>
+        <w:pStyle w:val="Heading2"/>
+      </w:pPr>
+      <w:r>
+        <w:rPr>
+          <w:lang w:val="en_US" w:bidi="en_US"/>
+        </w:rPr>
+        <w:t>Vineyard</w:t>
+      </w:r>
+      <w:r>
+        <w:rPr>
+          <w:lang w:val="en_US" w:bidi="en_US"/>
+        </w:rPr>
+      </w:r>
+    </w:p>
+    <w:p>
+      <w:pPr>
+        <w:pStyle w:val="Heading4"/>
+      </w:pPr>
+      <w:r>
+        <w:rPr>
+          <w:lang w:val="en_US" w:bidi="en_US"/>
+        </w:rPr>
+        <w:t>Image Content</w:t>
+      </w:r>
+      <w:r>
+        <w:rPr>
+          <w:lang w:val="en_US" w:bidi="en_US"/>
+        </w:rPr>
+      </w:r>
+    </w:p>
+    <w:p>
+      <w:pPr/>
+      <w:r>
+        <w:rPr>
+          <w:lang w:val="en_US" w:bidi="en_US"/>
+        </w:rPr>
+      </w:r>
+    </w:p>
+    <w:p>
+      <w:r>
+        <w:drawing>
+          <wp:inline xmlns:a="http://schemas.openxmlformats.org/drawingml/2006/main" xmlns:pic="http://schemas.openxmlformats.org/drawingml/2006/picture">
+            <wp:extent cx="6096000" cy="4090416"/>
+            <wp:docPr id="4" name="Picture 4"/>
+            <wp:cNvGraphicFramePr>
+              <a:graphicFrameLocks noChangeAspect="1"/>
+            </wp:cNvGraphicFramePr>
+            <a:graphic>
+              <a:graphicData uri="http://schemas.openxmlformats.org/drawingml/2006/picture">
+                <pic:pic>
+                  <pic:nvPicPr>
+                    <pic:cNvPr id="0" name="image.jpg"/>
+                    <pic:cNvPicPr/>
+                  </pic:nvPicPr>
+                  <pic:blipFill>
+                    <a:blip r:embed="rId19"/>
+                    <a:stretch>
+                      <a:fillRect/>
+                    </a:stretch>
+                  </pic:blipFill>
+                  <pic:spPr>
+                    <a:xfrm>
+                      <a:off x="0" y="0"/>
+                      <a:ext cx="6096000" cy="4090416"/>
+                    </a:xfrm>
+                    <a:prstGeom prst="rect"/>
+                  </pic:spPr>
+                </pic:pic>
+              </a:graphicData>
+            </a:graphic>
+          </wp:inline>
+        </w:drawing>
+      </w:r>
+    </w:p>
+    <w:p>
+      <w:pPr/>
+      <w:r>
+        <w:rPr>
+          <w:lang w:val="en_US" w:bidi="en_US"/>
+        </w:rPr>
+      </w:r>
+      <w:hyperlink r:id="rId20">
+        <w:r>
+          <w:rPr>
+            <w:lang w:val="en_US" w:bidi="en_US"/>
+          </w:rPr>
+          <w:rPr>
+            <w:color w:val="0000EE"/>
+            <w:u w:val="single"/>
+          </w:rPr>
+          <w:t>link</w:t>
+        </w:r>
+      </w:hyperlink>
+      <w:r>
+        <w:rPr>
+          <w:lang w:val="en_US" w:bidi="en_US"/>
+        </w:rPr>
+      </w:r>
+      <w:r>
+        <w:rPr>
+          <w:lang w:val="en_US" w:bidi="en_US"/>
+        </w:rPr>
+      </w:r>
+    </w:p>
+    <w:p>
+      <w:pPr/>
+      <w:r>
+        <w:rPr>
+          <w:lang w:val="en_US" w:bidi="en_US"/>
+        </w:rPr>
+      </w:r>
+    </w:p>
+    <w:p>
+      <w:pPr>
+        <w:pStyle w:val="Heading2"/>
+      </w:pPr>
+      <w:r>
+        <w:rPr>
+          <w:lang w:val="en_US" w:bidi="en_US"/>
+        </w:rPr>
+        <w:t>Vineyard</w:t>
+      </w:r>
+      <w:r>
+        <w:rPr>
+          <w:lang w:val="en_US" w:bidi="en_US"/>
+        </w:rPr>
+      </w:r>
+    </w:p>
+    <w:p>
+      <w:pPr>
+        <w:pStyle w:val="Heading4"/>
+      </w:pPr>
+      <w:r>
+        <w:rPr>
+          <w:lang w:val="en_US" w:bidi="en_US"/>
+        </w:rPr>
+        <w:t>Image Content</w:t>
+      </w:r>
+      <w:r>
+        <w:rPr>
+          <w:lang w:val="en_US" w:bidi="en_US"/>
+        </w:rPr>
+      </w:r>
+    </w:p>
+    <w:p>
+      <w:pPr/>
+      <w:r>
+        <w:rPr>
+          <w:lang w:val="en_US" w:bidi="en_US"/>
+        </w:rPr>
+      </w:r>
+    </w:p>
+    <w:p>
+      <w:r>
+        <w:drawing>
+          <wp:inline xmlns:a="http://schemas.openxmlformats.org/drawingml/2006/main" xmlns:pic="http://schemas.openxmlformats.org/drawingml/2006/picture">
+            <wp:extent cx="6096000" cy="4090416"/>
+            <wp:docPr id="5" name="Picture 5"/>
+            <wp:cNvGraphicFramePr>
+              <a:graphicFrameLocks noChangeAspect="1"/>
+            </wp:cNvGraphicFramePr>
+            <a:graphic>
+              <a:graphicData uri="http://schemas.openxmlformats.org/drawingml/2006/picture">
+                <pic:pic>
+                  <pic:nvPicPr>
+                    <pic:cNvPr id="0" name="image.jpg"/>
+                    <pic:cNvPicPr/>
+                  </pic:nvPicPr>
+                  <pic:blipFill>
+                    <a:blip r:embed="rId21"/>
+                    <a:stretch>
+                      <a:fillRect/>
+                    </a:stretch>
+                  </pic:blipFill>
+                  <pic:spPr>
+                    <a:xfrm>
+                      <a:off x="0" y="0"/>
+                      <a:ext cx="6096000" cy="4090416"/>
+                    </a:xfrm>
+                    <a:prstGeom prst="rect"/>
+                  </pic:spPr>
+                </pic:pic>
+              </a:graphicData>
+            </a:graphic>
+          </wp:inline>
+        </w:drawing>
+      </w:r>
+    </w:p>
+    <w:p>
+      <w:pPr/>
+      <w:r>
+        <w:rPr>
+          <w:lang w:val="en_US" w:bidi="en_US"/>
+        </w:rPr>
+      </w:r>
+      <w:hyperlink r:id="rId22">
+        <w:r>
+          <w:rPr>
+            <w:lang w:val="en_US" w:bidi="en_US"/>
+          </w:rPr>
+          <w:rPr>
+            <w:color w:val="0000EE"/>
+            <w:u w:val="single"/>
+          </w:rPr>
+          <w:t>link</w:t>
+        </w:r>
+      </w:hyperlink>
+      <w:r>
+        <w:rPr>
+          <w:lang w:val="en_US" w:bidi="en_US"/>
+        </w:rPr>
+      </w:r>
+      <w:r>
+        <w:rPr>
+          <w:lang w:val="en_US" w:bidi="en_US"/>
+        </w:rPr>
+      </w:r>
+    </w:p>
+    <w:p>
+      <w:pPr/>
+      <w:r>
+        <w:rPr>
+          <w:lang w:val="en_US" w:bidi="en_US"/>
+        </w:rPr>
+      </w:r>
+    </w:p>
+    <w:p>
+      <w:pPr>
+        <w:pStyle w:val="Heading2"/>
+      </w:pPr>
+      <w:r>
+        <w:rPr>
+          <w:lang w:val="en_US" w:bidi="en_US"/>
+        </w:rPr>
+        <w:t>Vultures Gathered Around a Dead Animal</w:t>
+      </w:r>
+      <w:r>
+        <w:rPr>
+          <w:lang w:val="en_US" w:bidi="en_US"/>
+        </w:rPr>
+      </w:r>
+    </w:p>
+    <w:p>
+      <w:pPr>
+        <w:pStyle w:val="Heading4"/>
+      </w:pPr>
+      <w:r>
+        <w:rPr>
+          <w:lang w:val="en_US" w:bidi="en_US"/>
+        </w:rPr>
+        <w:t>Image Content</w:t>
+      </w:r>
+      <w:r>
+        <w:rPr>
+          <w:lang w:val="en_US" w:bidi="en_US"/>
+        </w:rPr>
+      </w:r>
+    </w:p>
+    <w:p>
+      <w:pPr/>
+      <w:r>
+        <w:rPr>
+          <w:lang w:val="en_US" w:bidi="en_US"/>
+        </w:rPr>
+      </w:r>
+    </w:p>
+    <w:p>
+      <w:r>
+        <w:drawing>
+          <wp:inline xmlns:a="http://schemas.openxmlformats.org/drawingml/2006/main" xmlns:pic="http://schemas.openxmlformats.org/drawingml/2006/picture">
+            <wp:extent cx="6096000" cy="4059936"/>
+            <wp:docPr id="6" name="Picture 6"/>
+            <wp:cNvGraphicFramePr>
+              <a:graphicFrameLocks noChangeAspect="1"/>
+            </wp:cNvGraphicFramePr>
+            <a:graphic>
+              <a:graphicData uri="http://schemas.openxmlformats.org/drawingml/2006/picture">
+                <pic:pic>
+                  <pic:nvPicPr>
+                    <pic:cNvPr id="0" name="image.jpg"/>
+                    <pic:cNvPicPr/>
+                  </pic:nvPicPr>
+                  <pic:blipFill>
+                    <a:blip r:embed="rId23"/>
                     <a:stretch>
                       <a:fillRect/>
                     </a:stretch>
@@ -576,7 +835,7 @@
           <w:lang w:val="en_US" w:bidi="en_US"/>
         </w:rPr>
       </w:r>
-      <w:hyperlink r:id="rId19">
+      <w:hyperlink r:id="rId24">
         <w:r>
           <w:rPr>
             <w:lang w:val="en_US" w:bidi="en_US"/>
@@ -652,7 +911,7 @@
         <w:drawing>
           <wp:inline xmlns:a="http://schemas.openxmlformats.org/drawingml/2006/main" xmlns:pic="http://schemas.openxmlformats.org/drawingml/2006/picture">
             <wp:extent cx="6096000" cy="3419856"/>
-            <wp:docPr id="4" name="Picture 4"/>
+            <wp:docPr id="7" name="Picture 7"/>
             <wp:cNvGraphicFramePr>
               <a:graphicFrameLocks noChangeAspect="1"/>
             </wp:cNvGraphicFramePr>
@@ -664,7 +923,7 @@
                     <pic:cNvPicPr/>
                   </pic:nvPicPr>
                   <pic:blipFill>
-                    <a:blip r:embed="rId20"/>
+                    <a:blip r:embed="rId25"/>
                     <a:stretch>
                       <a:fillRect/>
                     </a:stretch>
@@ -690,7 +949,7 @@
           <w:lang w:val="en_US" w:bidi="en_US"/>
         </w:rPr>
       </w:r>
-      <w:hyperlink r:id="rId21">
+      <w:hyperlink r:id="rId26">
         <w:r>
           <w:rPr>
             <w:lang w:val="en_US" w:bidi="en_US"/>

</xml_diff>